<commit_message>
feat(security): atomic quotas, concurrency protection, rate limiting, and cost governance (sprint 07)
</commit_message>
<xml_diff>
--- a/RAPPORT_SYNTHESE_AMANUS_LEARN_AI.docx
+++ b/RAPPORT_SYNTHESE_AMANUS_LEARN_AI.docx
@@ -1315,6 +1315,33 @@
       </w:r>
     </w:p>
     <w:p>
+      <w:pPr>
+        <w:pStyle w:val="Heading2"/>
+        <w:spacing w:before="200" w:after="80"/>
+      </w:pPr>
+      <w:r>
+        <w:t>3.9 Sécurité, Quotas &amp; Maîtrise des Coûts IA (Sprint 07)</w:t>
+      </w:r>
+    </w:p>
+    <w:p>
+      <w:pPr>
+        <w:spacing w:line="276" w:lineRule="auto" w:after="120"/>
+      </w:pPr>
+      <w:r>
+        <w:t>Afin de garantir la rentabilité opérationnelle du SaaS et d'éliminer tout risque d'épuisement de ressources, un système de gouvernance des coûts et de quotas atomiques a été déployé :</w:t>
+        <w:br/>
+        <w:t>• Réservations Atomiques à Deux Phases : Déploiement du modèle QuotaReservation avec verrouillage exclusif PostgreSQL (select_for_update), empêchant tout dépassement lors de requêtes simultanées sur le dernier quota disponible.</w:t>
+        <w:br/>
+        <w:t>• Prévention du Double Comptage &amp; Idempotence : Les jetons idempotency_key protègent contre les retries réseau abusifs.</w:t>
+        <w:br/>
+        <w:t>• Quarantaine des Timeouts : En cas d'interruption réseau avec un fournisseur tiers, la requête est isolée sous le statut TIMEOUT_UNCERTAIN avec conservation du coût estimatif afin d'éviter toute surprise de facturation.</w:t>
+        <w:br/>
+        <w:t>• Throttling &amp; Protection Anti-Abus : Limitation de débit stricte (30 req/min et 10 req/10s) avec réponses normalisées HTTP 429.</w:t>
+        <w:br/>
+        <w:t>• Sécurité des Prompts : Détection proactive des tentatives de jailbreak, masquage des secrets et étanchéité du contexte source.</w:t>
+      </w:r>
+    </w:p>
+    <w:p>
       <w:r>
         <w:br w:type="page"/>
       </w:r>
@@ -1801,7 +1828,7 @@
                 <w:color w:val="059669"/>
                 <w:sz w:val="17"/>
               </w:rPr>
-              <w:t>310 tests passés avec succès (0 échec, 0 erreur)</w:t>
+              <w:t>326 tests passés avec succès (0 échec, 0 erreur)</w:t>
             </w:r>
           </w:p>
         </w:tc>
@@ -1984,7 +2011,7 @@
                 <w:color w:val="0F172A"/>
                 <w:sz w:val="17"/>
               </w:rPr>
-              <w:t>Vérification Typage Statique</w:t>
+              <w:t>Sécurité &amp; Quotas IA (Sprint 07)</w:t>
             </w:r>
           </w:p>
         </w:tc>
@@ -2009,6 +2036,84 @@
                 <w:color w:val="0F172A"/>
                 <w:sz w:val="17"/>
               </w:rPr>
+              <w:t>Pytest / Atomic Locks</w:t>
+            </w:r>
+          </w:p>
+        </w:tc>
+        <w:tc>
+          <w:tcPr>
+            <w:tcW w:type="dxa" w:w="4032"/>
+            <w:shd w:fill="FFFFFF"/>
+            <w:tcMar>
+              <w:top w:w="80" w:type="dxa"/>
+              <w:bottom w:w="80" w:type="dxa"/>
+              <w:left w:w="100" w:type="dxa"/>
+              <w:right w:w="100" w:type="dxa"/>
+            </w:tcMar>
+          </w:tcPr>
+          <w:p>
+            <w:pPr>
+              <w:spacing w:line="276" w:lineRule="auto"/>
+            </w:pPr>
+            <w:r>
+              <w:rPr>
+                <w:rFonts w:ascii="Arial" w:hAnsi="Arial"/>
+                <w:b/>
+                <w:color w:val="059669"/>
+                <w:sz w:val="17"/>
+              </w:rPr>
+              <w:t>16 tests validés (Réservations 2-phases, isolation, 429 throttling, anti-injection)</w:t>
+            </w:r>
+          </w:p>
+        </w:tc>
+      </w:tr>
+      <w:tr>
+        <w:tc>
+          <w:tcPr>
+            <w:tcW w:type="dxa" w:w="3168"/>
+            <w:shd w:fill="F8FAFC"/>
+            <w:tcMar>
+              <w:top w:w="80" w:type="dxa"/>
+              <w:bottom w:w="80" w:type="dxa"/>
+              <w:left w:w="100" w:type="dxa"/>
+              <w:right w:w="100" w:type="dxa"/>
+            </w:tcMar>
+          </w:tcPr>
+          <w:p>
+            <w:pPr>
+              <w:spacing w:line="276" w:lineRule="auto"/>
+            </w:pPr>
+            <w:r>
+              <w:rPr>
+                <w:rFonts w:ascii="Arial" w:hAnsi="Arial"/>
+                <w:color w:val="0F172A"/>
+                <w:sz w:val="17"/>
+              </w:rPr>
+              <w:t>Vérification Typage Statique</w:t>
+            </w:r>
+          </w:p>
+        </w:tc>
+        <w:tc>
+          <w:tcPr>
+            <w:tcW w:type="dxa" w:w="2160"/>
+            <w:shd w:fill="F8FAFC"/>
+            <w:tcMar>
+              <w:top w:w="80" w:type="dxa"/>
+              <w:bottom w:w="80" w:type="dxa"/>
+              <w:left w:w="100" w:type="dxa"/>
+              <w:right w:w="100" w:type="dxa"/>
+            </w:tcMar>
+          </w:tcPr>
+          <w:p>
+            <w:pPr>
+              <w:spacing w:line="276" w:lineRule="auto"/>
+            </w:pPr>
+            <w:r>
+              <w:rPr>
+                <w:rFonts w:ascii="Arial" w:hAnsi="Arial"/>
+                <w:color w:val="0F172A"/>
+                <w:sz w:val="17"/>
+              </w:rPr>
               <w:t>TypeScript (`tsc --noEmit`)</w:t>
             </w:r>
           </w:p>
@@ -2016,7 +2121,7 @@
         <w:tc>
           <w:tcPr>
             <w:tcW w:type="dxa" w:w="4032"/>
-            <w:shd w:fill="FFFFFF"/>
+            <w:shd w:fill="F8FAFC"/>
             <w:tcMar>
               <w:top w:w="80" w:type="dxa"/>
               <w:bottom w:w="80" w:type="dxa"/>
@@ -2044,7 +2149,7 @@
         <w:tc>
           <w:tcPr>
             <w:tcW w:type="dxa" w:w="3168"/>
-            <w:shd w:fill="F8FAFC"/>
+            <w:shd w:fill="FFFFFF"/>
             <w:tcMar>
               <w:top w:w="80" w:type="dxa"/>
               <w:bottom w:w="80" w:type="dxa"/>
@@ -2069,7 +2174,7 @@
         <w:tc>
           <w:tcPr>
             <w:tcW w:type="dxa" w:w="2160"/>
-            <w:shd w:fill="F8FAFC"/>
+            <w:shd w:fill="FFFFFF"/>
             <w:tcMar>
               <w:top w:w="80" w:type="dxa"/>
               <w:bottom w:w="80" w:type="dxa"/>
@@ -2094,7 +2199,7 @@
         <w:tc>
           <w:tcPr>
             <w:tcW w:type="dxa" w:w="4032"/>
-            <w:shd w:fill="F8FAFC"/>
+            <w:shd w:fill="FFFFFF"/>
             <w:tcMar>
               <w:top w:w="80" w:type="dxa"/>
               <w:bottom w:w="80" w:type="dxa"/>
@@ -2122,7 +2227,7 @@
         <w:tc>
           <w:tcPr>
             <w:tcW w:type="dxa" w:w="3168"/>
-            <w:shd w:fill="FFFFFF"/>
+            <w:shd w:fill="F8FAFC"/>
             <w:tcMar>
               <w:top w:w="80" w:type="dxa"/>
               <w:bottom w:w="80" w:type="dxa"/>
@@ -2147,7 +2252,7 @@
         <w:tc>
           <w:tcPr>
             <w:tcW w:type="dxa" w:w="2160"/>
-            <w:shd w:fill="FFFFFF"/>
+            <w:shd w:fill="F8FAFC"/>
             <w:tcMar>
               <w:top w:w="80" w:type="dxa"/>
               <w:bottom w:w="80" w:type="dxa"/>
@@ -2172,7 +2277,7 @@
         <w:tc>
           <w:tcPr>
             <w:tcW w:type="dxa" w:w="4032"/>
-            <w:shd w:fill="FFFFFF"/>
+            <w:shd w:fill="F8FAFC"/>
             <w:tcMar>
               <w:top w:w="80" w:type="dxa"/>
               <w:bottom w:w="80" w:type="dxa"/>

</xml_diff>

<commit_message>
feat(rag): implement Sprint 09 advanced hybrid search RRF and anti-hallucination safeguards
</commit_message>
<xml_diff>
--- a/RAPPORT_SYNTHESE_AMANUS_LEARN_AI.docx
+++ b/RAPPORT_SYNTHESE_AMANUS_LEARN_AI.docx
@@ -1828,7 +1828,7 @@
                 <w:color w:val="059669"/>
                 <w:sz w:val="17"/>
               </w:rPr>
-              <w:t>326 tests passés avec succès (0 échec, 0 erreur)</w:t>
+              <w:t>349 tests passés avec succès (0 échec, 0 erreur)</w:t>
             </w:r>
           </w:p>
         </w:tc>
@@ -1906,7 +1906,7 @@
                 <w:color w:val="059669"/>
                 <w:sz w:val="17"/>
               </w:rPr>
-              <w:t>32 tests passés avec succès (9 fichiers de test validés)</w:t>
+              <w:t>32 tests passés avec succès (8 suites de test validées)</w:t>
             </w:r>
           </w:p>
         </w:tc>
@@ -1933,7 +1933,7 @@
                 <w:color w:val="0F172A"/>
                 <w:sz w:val="17"/>
               </w:rPr>
-              <w:t>Évaluation Qualité IA (Sprint 06)</w:t>
+              <w:t>RAG Avancé &amp; Recherche Hybride (Sprint 09)</w:t>
             </w:r>
           </w:p>
         </w:tc>
@@ -1958,7 +1958,7 @@
                 <w:color w:val="0F172A"/>
                 <w:sz w:val="17"/>
               </w:rPr>
-              <w:t>Amanus Eval Suite / Pytest</w:t>
+              <w:t>RRF / pgvector / Lexical</w:t>
             </w:r>
           </w:p>
         </w:tc>
@@ -1984,7 +1984,7 @@
                 <w:color w:val="059669"/>
                 <w:sz w:val="17"/>
               </w:rPr>
-              <w:t>12 suites validées (Golden Benchmark, Déterministe, Sémantique, A/B)</w:t>
+              <w:t>13 tests validés (Fusion RRF k=60, acronymes, anti-hallucination, cache isolé, fallback gracieux)</w:t>
             </w:r>
           </w:p>
         </w:tc>
@@ -2011,7 +2011,7 @@
                 <w:color w:val="0F172A"/>
                 <w:sz w:val="17"/>
               </w:rPr>
-              <w:t>Sécurité &amp; Quotas IA (Sprint 07)</w:t>
+              <w:t>Ingestion &amp; Robustesse Documentaire (Sprint 08)</w:t>
             </w:r>
           </w:p>
         </w:tc>
@@ -2036,7 +2036,7 @@
                 <w:color w:val="0F172A"/>
                 <w:sz w:val="17"/>
               </w:rPr>
-              <w:t>Pytest / Atomic Locks</w:t>
+              <w:t>Pytest / Validation Binaire</w:t>
             </w:r>
           </w:p>
         </w:tc>
@@ -2062,7 +2062,163 @@
                 <w:color w:val="059669"/>
                 <w:sz w:val="17"/>
               </w:rPr>
+              <w:t>10 tests validés (Contrôle qualité, anti-corruption, détection PDF/DOCX/PPTX, zip bombs)</w:t>
+            </w:r>
+          </w:p>
+        </w:tc>
+      </w:tr>
+      <w:tr>
+        <w:tc>
+          <w:tcPr>
+            <w:tcW w:type="dxa" w:w="3168"/>
+            <w:shd w:fill="F8FAFC"/>
+            <w:tcMar>
+              <w:top w:w="80" w:type="dxa"/>
+              <w:bottom w:w="80" w:type="dxa"/>
+              <w:left w:w="100" w:type="dxa"/>
+              <w:right w:w="100" w:type="dxa"/>
+            </w:tcMar>
+          </w:tcPr>
+          <w:p>
+            <w:pPr>
+              <w:spacing w:line="276" w:lineRule="auto"/>
+            </w:pPr>
+            <w:r>
+              <w:rPr>
+                <w:rFonts w:ascii="Arial" w:hAnsi="Arial"/>
+                <w:color w:val="0F172A"/>
+                <w:sz w:val="17"/>
+              </w:rPr>
+              <w:t>Sécurité &amp; Quotas IA (Sprint 07)</w:t>
+            </w:r>
+          </w:p>
+        </w:tc>
+        <w:tc>
+          <w:tcPr>
+            <w:tcW w:type="dxa" w:w="2160"/>
+            <w:shd w:fill="F8FAFC"/>
+            <w:tcMar>
+              <w:top w:w="80" w:type="dxa"/>
+              <w:bottom w:w="80" w:type="dxa"/>
+              <w:left w:w="100" w:type="dxa"/>
+              <w:right w:w="100" w:type="dxa"/>
+            </w:tcMar>
+          </w:tcPr>
+          <w:p>
+            <w:pPr>
+              <w:spacing w:line="276" w:lineRule="auto"/>
+            </w:pPr>
+            <w:r>
+              <w:rPr>
+                <w:rFonts w:ascii="Arial" w:hAnsi="Arial"/>
+                <w:color w:val="0F172A"/>
+                <w:sz w:val="17"/>
+              </w:rPr>
+              <w:t>Pytest / Atomic Locks</w:t>
+            </w:r>
+          </w:p>
+        </w:tc>
+        <w:tc>
+          <w:tcPr>
+            <w:tcW w:type="dxa" w:w="4032"/>
+            <w:shd w:fill="F8FAFC"/>
+            <w:tcMar>
+              <w:top w:w="80" w:type="dxa"/>
+              <w:bottom w:w="80" w:type="dxa"/>
+              <w:left w:w="100" w:type="dxa"/>
+              <w:right w:w="100" w:type="dxa"/>
+            </w:tcMar>
+          </w:tcPr>
+          <w:p>
+            <w:pPr>
+              <w:spacing w:line="276" w:lineRule="auto"/>
+            </w:pPr>
+            <w:r>
+              <w:rPr>
+                <w:rFonts w:ascii="Arial" w:hAnsi="Arial"/>
+                <w:b/>
+                <w:color w:val="059669"/>
+                <w:sz w:val="17"/>
+              </w:rPr>
               <w:t>16 tests validés (Réservations 2-phases, isolation, 429 throttling, anti-injection)</w:t>
+            </w:r>
+          </w:p>
+        </w:tc>
+      </w:tr>
+      <w:tr>
+        <w:tc>
+          <w:tcPr>
+            <w:tcW w:type="dxa" w:w="3168"/>
+            <w:shd w:fill="FFFFFF"/>
+            <w:tcMar>
+              <w:top w:w="80" w:type="dxa"/>
+              <w:bottom w:w="80" w:type="dxa"/>
+              <w:left w:w="100" w:type="dxa"/>
+              <w:right w:w="100" w:type="dxa"/>
+            </w:tcMar>
+          </w:tcPr>
+          <w:p>
+            <w:pPr>
+              <w:spacing w:line="276" w:lineRule="auto"/>
+            </w:pPr>
+            <w:r>
+              <w:rPr>
+                <w:rFonts w:ascii="Arial" w:hAnsi="Arial"/>
+                <w:color w:val="0F172A"/>
+                <w:sz w:val="17"/>
+              </w:rPr>
+              <w:t>Évaluation Qualité IA (Sprint 06)</w:t>
+            </w:r>
+          </w:p>
+        </w:tc>
+        <w:tc>
+          <w:tcPr>
+            <w:tcW w:type="dxa" w:w="2160"/>
+            <w:shd w:fill="FFFFFF"/>
+            <w:tcMar>
+              <w:top w:w="80" w:type="dxa"/>
+              <w:bottom w:w="80" w:type="dxa"/>
+              <w:left w:w="100" w:type="dxa"/>
+              <w:right w:w="100" w:type="dxa"/>
+            </w:tcMar>
+          </w:tcPr>
+          <w:p>
+            <w:pPr>
+              <w:spacing w:line="276" w:lineRule="auto"/>
+            </w:pPr>
+            <w:r>
+              <w:rPr>
+                <w:rFonts w:ascii="Arial" w:hAnsi="Arial"/>
+                <w:color w:val="0F172A"/>
+                <w:sz w:val="17"/>
+              </w:rPr>
+              <w:t>Amanus Eval Suite / Pytest</w:t>
+            </w:r>
+          </w:p>
+        </w:tc>
+        <w:tc>
+          <w:tcPr>
+            <w:tcW w:type="dxa" w:w="4032"/>
+            <w:shd w:fill="FFFFFF"/>
+            <w:tcMar>
+              <w:top w:w="80" w:type="dxa"/>
+              <w:bottom w:w="80" w:type="dxa"/>
+              <w:left w:w="100" w:type="dxa"/>
+              <w:right w:w="100" w:type="dxa"/>
+            </w:tcMar>
+          </w:tcPr>
+          <w:p>
+            <w:pPr>
+              <w:spacing w:line="276" w:lineRule="auto"/>
+            </w:pPr>
+            <w:r>
+              <w:rPr>
+                <w:rFonts w:ascii="Arial" w:hAnsi="Arial"/>
+                <w:b/>
+                <w:color w:val="059669"/>
+                <w:sz w:val="17"/>
+              </w:rPr>
+              <w:t>12 suites validées (Golden Benchmark, Déterministe, Sémantique, A/B)</w:t>
             </w:r>
           </w:p>
         </w:tc>
@@ -2167,7 +2323,7 @@
                 <w:color w:val="0F172A"/>
                 <w:sz w:val="17"/>
               </w:rPr>
-              <w:t>Linting &amp; Qualité Code Web</w:t>
+              <w:t>Linting &amp; Qualité Code</w:t>
             </w:r>
           </w:p>
         </w:tc>
@@ -2218,7 +2374,7 @@
                 <w:color w:val="059669"/>
                 <w:sz w:val="17"/>
               </w:rPr>
-              <w:t>0 avertissement, 0 erreur, règles de hooks respectées</w:t>
+              <w:t>0 avertissement, 0 erreur, code propre et formatté</w:t>
             </w:r>
           </w:p>
         </w:tc>

</xml_diff>

<commit_message>
feat(sprint-10): Controlled pedagogical generation, cross-modal consistency, blueprint schema and multi-tier summaries
</commit_message>
<xml_diff>
--- a/RAPPORT_SYNTHESE_AMANUS_LEARN_AI.docx
+++ b/RAPPORT_SYNTHESE_AMANUS_LEARN_AI.docx
@@ -1342,6 +1342,35 @@
       </w:r>
     </w:p>
     <w:p>
+      <w:pPr>
+        <w:pStyle w:val="Heading2"/>
+        <w:spacing w:before="200" w:after="80"/>
+      </w:pPr>
+      <w:r>
+        <w:t>3.10 Génération Pédagogique Contrôlée &amp; Cohérence Inter-Formats (Sprint 10)</w:t>
+      </w:r>
+    </w:p>
+    <w:p>
+      <w:pPr>
+        <w:spacing w:line="276" w:lineRule="auto" w:after="120"/>
+      </w:pPr>
+      <w:r>
+        <w:t>Afin d'éradiquer les discordances conceptuelles et d'harmoniser l'expérience pédagogique multi-supports, un système de génération contrôlée fondé sur un schéma pivot unifié a été déployé :</w:t>
+        <w:br/>
+        <w:t>• Schéma Pivot &amp; Base Pédagogique Commune (blueprint-v1.0) : Définition formelle des objectifs d'apprentissage (Bloom), concepts clés canoniques et séquençage dissociant strictement les faits sources ('source_facts') des analogies illustratives ('pedagogical_examples').</w:t>
+        <w:br/>
+        <w:t>• Dérivation Déterministe : Capacité de dériver instantanément le blueprint à partir d'un cours validé par un enseignant sans déclencher d'appel LLM redondant.</w:t>
+        <w:br/>
+        <w:t>• Résumés Multi-Niveaux : Support natif de 3 niveaux de granularité (very_short en 100 mots et 3 points clés, synthetic en 2-3 paragraphes, detailed par chapitre avec conditions limites).</w:t>
+        <w:br/>
+        <w:t>• Quiz Groundés &amp; Alertes de Quota Source : Alignement des QCM sur les objectifs d'apprentissage, proscription des méta-distracteurs et des tautologies, et émission d'avertissements de calibrage lorsque les sources sont trop restreintes plutôt que d'inventer des questions.</w:t>
+        <w:br/>
+        <w:t>• Adaptation au Canal Audio : Élimination automatique des repères visuels ('voir ci-dessus', 'comme illustré', 'le tableau ci-contre') et conversion des tableaux markdown en narration parlée fluide.</w:t>
+        <w:br/>
+        <w:t>• Validateur de Cohérence Inter-Formats &amp; Remédiation Bornée : Mesure de couverture conceptuelle multi-formats et remédiation strictement limitée à une seule tentative (max_retries &lt;= 1).</w:t>
+      </w:r>
+    </w:p>
+    <w:p>
       <w:r>
         <w:br w:type="page"/>
       </w:r>
@@ -1828,7 +1857,7 @@
                 <w:color w:val="059669"/>
                 <w:sz w:val="17"/>
               </w:rPr>
-              <w:t>349 tests passés avec succès (0 échec, 0 erreur)</w:t>
+              <w:t>364 tests passés avec succès (0 échec, 0 erreur)</w:t>
             </w:r>
           </w:p>
         </w:tc>
@@ -1933,7 +1962,7 @@
                 <w:color w:val="0F172A"/>
                 <w:sz w:val="17"/>
               </w:rPr>
-              <w:t>RAG Avancé &amp; Recherche Hybride (Sprint 09)</w:t>
+              <w:t>Génération Pédagogique Contrôlée (Sprint 10)</w:t>
             </w:r>
           </w:p>
         </w:tc>
@@ -1958,6 +1987,84 @@
                 <w:color w:val="0F172A"/>
                 <w:sz w:val="17"/>
               </w:rPr>
+              <w:t>Blueprint / ConsistencyValidator</w:t>
+            </w:r>
+          </w:p>
+        </w:tc>
+        <w:tc>
+          <w:tcPr>
+            <w:tcW w:type="dxa" w:w="4032"/>
+            <w:shd w:fill="F8FAFC"/>
+            <w:tcMar>
+              <w:top w:w="80" w:type="dxa"/>
+              <w:bottom w:w="80" w:type="dxa"/>
+              <w:left w:w="100" w:type="dxa"/>
+              <w:right w:w="100" w:type="dxa"/>
+            </w:tcMar>
+          </w:tcPr>
+          <w:p>
+            <w:pPr>
+              <w:spacing w:line="276" w:lineRule="auto"/>
+            </w:pPr>
+            <w:r>
+              <w:rPr>
+                <w:rFonts w:ascii="Arial" w:hAnsi="Arial"/>
+                <w:b/>
+                <w:color w:val="059669"/>
+                <w:sz w:val="17"/>
+              </w:rPr>
+              <w:t>15 tests validés (Schéma pivot blueprint-v1.0, résumés multi-niveaux, quiz groundés avec alertes, audio sans repères visuels, validateur cross-modal et remédiation bornée)</w:t>
+            </w:r>
+          </w:p>
+        </w:tc>
+      </w:tr>
+      <w:tr>
+        <w:tc>
+          <w:tcPr>
+            <w:tcW w:type="dxa" w:w="3168"/>
+            <w:shd w:fill="FFFFFF"/>
+            <w:tcMar>
+              <w:top w:w="80" w:type="dxa"/>
+              <w:bottom w:w="80" w:type="dxa"/>
+              <w:left w:w="100" w:type="dxa"/>
+              <w:right w:w="100" w:type="dxa"/>
+            </w:tcMar>
+          </w:tcPr>
+          <w:p>
+            <w:pPr>
+              <w:spacing w:line="276" w:lineRule="auto"/>
+            </w:pPr>
+            <w:r>
+              <w:rPr>
+                <w:rFonts w:ascii="Arial" w:hAnsi="Arial"/>
+                <w:color w:val="0F172A"/>
+                <w:sz w:val="17"/>
+              </w:rPr>
+              <w:t>RAG Avancé &amp; Recherche Hybride (Sprint 09)</w:t>
+            </w:r>
+          </w:p>
+        </w:tc>
+        <w:tc>
+          <w:tcPr>
+            <w:tcW w:type="dxa" w:w="2160"/>
+            <w:shd w:fill="FFFFFF"/>
+            <w:tcMar>
+              <w:top w:w="80" w:type="dxa"/>
+              <w:bottom w:w="80" w:type="dxa"/>
+              <w:left w:w="100" w:type="dxa"/>
+              <w:right w:w="100" w:type="dxa"/>
+            </w:tcMar>
+          </w:tcPr>
+          <w:p>
+            <w:pPr>
+              <w:spacing w:line="276" w:lineRule="auto"/>
+            </w:pPr>
+            <w:r>
+              <w:rPr>
+                <w:rFonts w:ascii="Arial" w:hAnsi="Arial"/>
+                <w:color w:val="0F172A"/>
+                <w:sz w:val="17"/>
+              </w:rPr>
               <w:t>RRF / pgvector / Lexical</w:t>
             </w:r>
           </w:p>
@@ -1965,7 +2072,7 @@
         <w:tc>
           <w:tcPr>
             <w:tcW w:type="dxa" w:w="4032"/>
-            <w:shd w:fill="F8FAFC"/>
+            <w:shd w:fill="FFFFFF"/>
             <w:tcMar>
               <w:top w:w="80" w:type="dxa"/>
               <w:bottom w:w="80" w:type="dxa"/>
@@ -1993,7 +2100,7 @@
         <w:tc>
           <w:tcPr>
             <w:tcW w:type="dxa" w:w="3168"/>
-            <w:shd w:fill="FFFFFF"/>
+            <w:shd w:fill="F8FAFC"/>
             <w:tcMar>
               <w:top w:w="80" w:type="dxa"/>
               <w:bottom w:w="80" w:type="dxa"/>
@@ -2018,7 +2125,7 @@
         <w:tc>
           <w:tcPr>
             <w:tcW w:type="dxa" w:w="2160"/>
-            <w:shd w:fill="FFFFFF"/>
+            <w:shd w:fill="F8FAFC"/>
             <w:tcMar>
               <w:top w:w="80" w:type="dxa"/>
               <w:bottom w:w="80" w:type="dxa"/>
@@ -2043,7 +2150,7 @@
         <w:tc>
           <w:tcPr>
             <w:tcW w:type="dxa" w:w="4032"/>
-            <w:shd w:fill="FFFFFF"/>
+            <w:shd w:fill="F8FAFC"/>
             <w:tcMar>
               <w:top w:w="80" w:type="dxa"/>
               <w:bottom w:w="80" w:type="dxa"/>
@@ -2071,7 +2178,7 @@
         <w:tc>
           <w:tcPr>
             <w:tcW w:type="dxa" w:w="3168"/>
-            <w:shd w:fill="F8FAFC"/>
+            <w:shd w:fill="FFFFFF"/>
             <w:tcMar>
               <w:top w:w="80" w:type="dxa"/>
               <w:bottom w:w="80" w:type="dxa"/>
@@ -2096,7 +2203,7 @@
         <w:tc>
           <w:tcPr>
             <w:tcW w:type="dxa" w:w="2160"/>
-            <w:shd w:fill="F8FAFC"/>
+            <w:shd w:fill="FFFFFF"/>
             <w:tcMar>
               <w:top w:w="80" w:type="dxa"/>
               <w:bottom w:w="80" w:type="dxa"/>
@@ -2121,7 +2228,7 @@
         <w:tc>
           <w:tcPr>
             <w:tcW w:type="dxa" w:w="4032"/>
-            <w:shd w:fill="F8FAFC"/>
+            <w:shd w:fill="FFFFFF"/>
             <w:tcMar>
               <w:top w:w="80" w:type="dxa"/>
               <w:bottom w:w="80" w:type="dxa"/>
@@ -2149,7 +2256,7 @@
         <w:tc>
           <w:tcPr>
             <w:tcW w:type="dxa" w:w="3168"/>
-            <w:shd w:fill="FFFFFF"/>
+            <w:shd w:fill="F8FAFC"/>
             <w:tcMar>
               <w:top w:w="80" w:type="dxa"/>
               <w:bottom w:w="80" w:type="dxa"/>
@@ -2174,7 +2281,7 @@
         <w:tc>
           <w:tcPr>
             <w:tcW w:type="dxa" w:w="2160"/>
-            <w:shd w:fill="FFFFFF"/>
+            <w:shd w:fill="F8FAFC"/>
             <w:tcMar>
               <w:top w:w="80" w:type="dxa"/>
               <w:bottom w:w="80" w:type="dxa"/>
@@ -2199,7 +2306,7 @@
         <w:tc>
           <w:tcPr>
             <w:tcW w:type="dxa" w:w="4032"/>
-            <w:shd w:fill="FFFFFF"/>
+            <w:shd w:fill="F8FAFC"/>
             <w:tcMar>
               <w:top w:w="80" w:type="dxa"/>
               <w:bottom w:w="80" w:type="dxa"/>
@@ -2227,7 +2334,7 @@
         <w:tc>
           <w:tcPr>
             <w:tcW w:type="dxa" w:w="3168"/>
-            <w:shd w:fill="F8FAFC"/>
+            <w:shd w:fill="FFFFFF"/>
             <w:tcMar>
               <w:top w:w="80" w:type="dxa"/>
               <w:bottom w:w="80" w:type="dxa"/>
@@ -2252,7 +2359,7 @@
         <w:tc>
           <w:tcPr>
             <w:tcW w:type="dxa" w:w="2160"/>
-            <w:shd w:fill="F8FAFC"/>
+            <w:shd w:fill="FFFFFF"/>
             <w:tcMar>
               <w:top w:w="80" w:type="dxa"/>
               <w:bottom w:w="80" w:type="dxa"/>
@@ -2277,7 +2384,7 @@
         <w:tc>
           <w:tcPr>
             <w:tcW w:type="dxa" w:w="4032"/>
-            <w:shd w:fill="F8FAFC"/>
+            <w:shd w:fill="FFFFFF"/>
             <w:tcMar>
               <w:top w:w="80" w:type="dxa"/>
               <w:bottom w:w="80" w:type="dxa"/>
@@ -2305,7 +2412,7 @@
         <w:tc>
           <w:tcPr>
             <w:tcW w:type="dxa" w:w="3168"/>
-            <w:shd w:fill="FFFFFF"/>
+            <w:shd w:fill="F8FAFC"/>
             <w:tcMar>
               <w:top w:w="80" w:type="dxa"/>
               <w:bottom w:w="80" w:type="dxa"/>
@@ -2330,7 +2437,7 @@
         <w:tc>
           <w:tcPr>
             <w:tcW w:type="dxa" w:w="2160"/>
-            <w:shd w:fill="FFFFFF"/>
+            <w:shd w:fill="F8FAFC"/>
             <w:tcMar>
               <w:top w:w="80" w:type="dxa"/>
               <w:bottom w:w="80" w:type="dxa"/>
@@ -2355,7 +2462,7 @@
         <w:tc>
           <w:tcPr>
             <w:tcW w:type="dxa" w:w="4032"/>
-            <w:shd w:fill="FFFFFF"/>
+            <w:shd w:fill="F8FAFC"/>
             <w:tcMar>
               <w:top w:w="80" w:type="dxa"/>
               <w:bottom w:w="80" w:type="dxa"/>
@@ -2383,7 +2490,7 @@
         <w:tc>
           <w:tcPr>
             <w:tcW w:type="dxa" w:w="3168"/>
-            <w:shd w:fill="F8FAFC"/>
+            <w:shd w:fill="FFFFFF"/>
             <w:tcMar>
               <w:top w:w="80" w:type="dxa"/>
               <w:bottom w:w="80" w:type="dxa"/>
@@ -2408,7 +2515,7 @@
         <w:tc>
           <w:tcPr>
             <w:tcW w:type="dxa" w:w="2160"/>
-            <w:shd w:fill="F8FAFC"/>
+            <w:shd w:fill="FFFFFF"/>
             <w:tcMar>
               <w:top w:w="80" w:type="dxa"/>
               <w:bottom w:w="80" w:type="dxa"/>
@@ -2433,7 +2540,7 @@
         <w:tc>
           <w:tcPr>
             <w:tcW w:type="dxa" w:w="4032"/>
-            <w:shd w:fill="F8FAFC"/>
+            <w:shd w:fill="FFFFFF"/>
             <w:tcMar>
               <w:top w:w="80" w:type="dxa"/>
               <w:bottom w:w="80" w:type="dxa"/>

</xml_diff>

<commit_message>
feat(sprint-11): parcours d'apprentissage, progression, scoring serveur et personnalisation
</commit_message>
<xml_diff>
--- a/RAPPORT_SYNTHESE_AMANUS_LEARN_AI.docx
+++ b/RAPPORT_SYNTHESE_AMANUS_LEARN_AI.docx
@@ -1371,6 +1371,33 @@
       </w:r>
     </w:p>
     <w:p>
+      <w:pPr>
+        <w:pStyle w:val="Heading2"/>
+        <w:spacing w:before="200" w:after="80"/>
+      </w:pPr>
+      <w:r>
+        <w:t>3.11 Parcours d'Apprentissage, Progression &amp; Personnalisation (Sprint 11)</w:t>
+      </w:r>
+    </w:p>
+    <w:p>
+      <w:pPr>
+        <w:spacing w:line="276" w:lineRule="auto" w:after="120"/>
+      </w:pPr>
+      <w:r>
+        <w:t>Afin d'offrir à chaque apprenant un accompagnement sur mesure, persistant et rigoureux, un ensemble complet de services de progression et de personnalisation a été implémenté :</w:t>
+        <w:br/>
+        <w:t>• Modèle de Progression Étanche : Distinction nette entre contenu disponible, consulté (scroll/position mémorisée), déclaré terminé (is_completed avec horodatage completed_at) et évalué. Une simple consultation ne valide jamais une leçon à tort.</w:t>
+        <w:br/>
+        <w:t>• Calcul Déterministe de Complétion : Progression globale du cours calculée à partir des sections réelles avec transitions d'état strictes (NOT_STARTED → IN_PROGRESS → COMPLETED) sans états impossibles ni pourcentages arbitraires.</w:t>
+        <w:br/>
+        <w:t>• Reprise Intelligente de l'Apprentissage (Continue Learning) : Détection dynamique du premier chapitre non terminé sur les cours actifs, restitution exacte de la dernière position de lecture, résilience aux contenus modifiés/supprimés et absence de boucle infinie sur les cours terminés.</w:t>
+        <w:br/>
+        <w:t>• Évaluation &amp; Scoring Strictement Serveur : Calcul des scores de quiz 100% côté backend avec verrouillage transactionnel (select_for_update) prévenant les attaques par rejeu ou soumissions concurrentes. Distinction explicite entre le meilleur score ('best_score'), le dernier score ('latest_score') et l'historique complet paginé.</w:t>
+        <w:br/>
+        <w:t>• Recommandations Déterministes &amp; Explicables : Détection des notions nécessitant remédiation (score &lt; 60%) avec rattachement aux citations sources et objectifs pédagogiques du blueprint, propositions ciblées de révision et respect des états vides sans fabrication de lacunes imaginaires.</w:t>
+      </w:r>
+    </w:p>
+    <w:p>
       <w:r>
         <w:br w:type="page"/>
       </w:r>
@@ -1857,7 +1884,7 @@
                 <w:color w:val="059669"/>
                 <w:sz w:val="17"/>
               </w:rPr>
-              <w:t>364 tests passés avec succès (0 échec, 0 erreur)</w:t>
+              <w:t>376 tests passés avec succès (0 échec, 0 erreur)</w:t>
             </w:r>
           </w:p>
         </w:tc>
@@ -1962,7 +1989,7 @@
                 <w:color w:val="0F172A"/>
                 <w:sz w:val="17"/>
               </w:rPr>
-              <w:t>Génération Pédagogique Contrôlée (Sprint 10)</w:t>
+              <w:t>Progression &amp; Personnalisation (Sprint 11)</w:t>
             </w:r>
           </w:p>
         </w:tc>
@@ -1987,6 +2014,84 @@
                 <w:color w:val="0F172A"/>
                 <w:sz w:val="17"/>
               </w:rPr>
+              <w:t>Pytest / LearningEngine / Quizzes</w:t>
+            </w:r>
+          </w:p>
+        </w:tc>
+        <w:tc>
+          <w:tcPr>
+            <w:tcW w:type="dxa" w:w="4032"/>
+            <w:shd w:fill="F8FAFC"/>
+            <w:tcMar>
+              <w:top w:w="80" w:type="dxa"/>
+              <w:bottom w:w="80" w:type="dxa"/>
+              <w:left w:w="100" w:type="dxa"/>
+              <w:right w:w="100" w:type="dxa"/>
+            </w:tcMar>
+          </w:tcPr>
+          <w:p>
+            <w:pPr>
+              <w:spacing w:line="276" w:lineRule="auto"/>
+            </w:pPr>
+            <w:r>
+              <w:rPr>
+                <w:rFonts w:ascii="Arial" w:hAnsi="Arial"/>
+                <w:b/>
+                <w:color w:val="059669"/>
+                <w:sz w:val="17"/>
+              </w:rPr>
+              <w:t>12 tests validés (Complétion explicite vs consultation, reprise continue_learning, scoring serveur, distinction best/latest score, historique paginé, verrouillage atomique concurrent, recommandations déterministes, résilience orphelins)</w:t>
+            </w:r>
+          </w:p>
+        </w:tc>
+      </w:tr>
+      <w:tr>
+        <w:tc>
+          <w:tcPr>
+            <w:tcW w:type="dxa" w:w="3168"/>
+            <w:shd w:fill="FFFFFF"/>
+            <w:tcMar>
+              <w:top w:w="80" w:type="dxa"/>
+              <w:bottom w:w="80" w:type="dxa"/>
+              <w:left w:w="100" w:type="dxa"/>
+              <w:right w:w="100" w:type="dxa"/>
+            </w:tcMar>
+          </w:tcPr>
+          <w:p>
+            <w:pPr>
+              <w:spacing w:line="276" w:lineRule="auto"/>
+            </w:pPr>
+            <w:r>
+              <w:rPr>
+                <w:rFonts w:ascii="Arial" w:hAnsi="Arial"/>
+                <w:color w:val="0F172A"/>
+                <w:sz w:val="17"/>
+              </w:rPr>
+              <w:t>Génération Pédagogique Contrôlée (Sprint 10)</w:t>
+            </w:r>
+          </w:p>
+        </w:tc>
+        <w:tc>
+          <w:tcPr>
+            <w:tcW w:type="dxa" w:w="2160"/>
+            <w:shd w:fill="FFFFFF"/>
+            <w:tcMar>
+              <w:top w:w="80" w:type="dxa"/>
+              <w:bottom w:w="80" w:type="dxa"/>
+              <w:left w:w="100" w:type="dxa"/>
+              <w:right w:w="100" w:type="dxa"/>
+            </w:tcMar>
+          </w:tcPr>
+          <w:p>
+            <w:pPr>
+              <w:spacing w:line="276" w:lineRule="auto"/>
+            </w:pPr>
+            <w:r>
+              <w:rPr>
+                <w:rFonts w:ascii="Arial" w:hAnsi="Arial"/>
+                <w:color w:val="0F172A"/>
+                <w:sz w:val="17"/>
+              </w:rPr>
               <w:t>Blueprint / ConsistencyValidator</w:t>
             </w:r>
           </w:p>
@@ -1994,7 +2099,7 @@
         <w:tc>
           <w:tcPr>
             <w:tcW w:type="dxa" w:w="4032"/>
-            <w:shd w:fill="F8FAFC"/>
+            <w:shd w:fill="FFFFFF"/>
             <w:tcMar>
               <w:top w:w="80" w:type="dxa"/>
               <w:bottom w:w="80" w:type="dxa"/>
@@ -2022,7 +2127,7 @@
         <w:tc>
           <w:tcPr>
             <w:tcW w:type="dxa" w:w="3168"/>
-            <w:shd w:fill="FFFFFF"/>
+            <w:shd w:fill="F8FAFC"/>
             <w:tcMar>
               <w:top w:w="80" w:type="dxa"/>
               <w:bottom w:w="80" w:type="dxa"/>
@@ -2047,7 +2152,7 @@
         <w:tc>
           <w:tcPr>
             <w:tcW w:type="dxa" w:w="2160"/>
-            <w:shd w:fill="FFFFFF"/>
+            <w:shd w:fill="F8FAFC"/>
             <w:tcMar>
               <w:top w:w="80" w:type="dxa"/>
               <w:bottom w:w="80" w:type="dxa"/>
@@ -2072,7 +2177,7 @@
         <w:tc>
           <w:tcPr>
             <w:tcW w:type="dxa" w:w="4032"/>
-            <w:shd w:fill="FFFFFF"/>
+            <w:shd w:fill="F8FAFC"/>
             <w:tcMar>
               <w:top w:w="80" w:type="dxa"/>
               <w:bottom w:w="80" w:type="dxa"/>
@@ -2100,7 +2205,7 @@
         <w:tc>
           <w:tcPr>
             <w:tcW w:type="dxa" w:w="3168"/>
-            <w:shd w:fill="F8FAFC"/>
+            <w:shd w:fill="FFFFFF"/>
             <w:tcMar>
               <w:top w:w="80" w:type="dxa"/>
               <w:bottom w:w="80" w:type="dxa"/>
@@ -2125,7 +2230,7 @@
         <w:tc>
           <w:tcPr>
             <w:tcW w:type="dxa" w:w="2160"/>
-            <w:shd w:fill="F8FAFC"/>
+            <w:shd w:fill="FFFFFF"/>
             <w:tcMar>
               <w:top w:w="80" w:type="dxa"/>
               <w:bottom w:w="80" w:type="dxa"/>
@@ -2150,7 +2255,7 @@
         <w:tc>
           <w:tcPr>
             <w:tcW w:type="dxa" w:w="4032"/>
-            <w:shd w:fill="F8FAFC"/>
+            <w:shd w:fill="FFFFFF"/>
             <w:tcMar>
               <w:top w:w="80" w:type="dxa"/>
               <w:bottom w:w="80" w:type="dxa"/>
@@ -2178,7 +2283,7 @@
         <w:tc>
           <w:tcPr>
             <w:tcW w:type="dxa" w:w="3168"/>
-            <w:shd w:fill="FFFFFF"/>
+            <w:shd w:fill="F8FAFC"/>
             <w:tcMar>
               <w:top w:w="80" w:type="dxa"/>
               <w:bottom w:w="80" w:type="dxa"/>
@@ -2203,7 +2308,7 @@
         <w:tc>
           <w:tcPr>
             <w:tcW w:type="dxa" w:w="2160"/>
-            <w:shd w:fill="FFFFFF"/>
+            <w:shd w:fill="F8FAFC"/>
             <w:tcMar>
               <w:top w:w="80" w:type="dxa"/>
               <w:bottom w:w="80" w:type="dxa"/>
@@ -2228,7 +2333,7 @@
         <w:tc>
           <w:tcPr>
             <w:tcW w:type="dxa" w:w="4032"/>
-            <w:shd w:fill="FFFFFF"/>
+            <w:shd w:fill="F8FAFC"/>
             <w:tcMar>
               <w:top w:w="80" w:type="dxa"/>
               <w:bottom w:w="80" w:type="dxa"/>
@@ -2256,7 +2361,7 @@
         <w:tc>
           <w:tcPr>
             <w:tcW w:type="dxa" w:w="3168"/>
-            <w:shd w:fill="F8FAFC"/>
+            <w:shd w:fill="FFFFFF"/>
             <w:tcMar>
               <w:top w:w="80" w:type="dxa"/>
               <w:bottom w:w="80" w:type="dxa"/>
@@ -2281,7 +2386,7 @@
         <w:tc>
           <w:tcPr>
             <w:tcW w:type="dxa" w:w="2160"/>
-            <w:shd w:fill="F8FAFC"/>
+            <w:shd w:fill="FFFFFF"/>
             <w:tcMar>
               <w:top w:w="80" w:type="dxa"/>
               <w:bottom w:w="80" w:type="dxa"/>
@@ -2306,7 +2411,7 @@
         <w:tc>
           <w:tcPr>
             <w:tcW w:type="dxa" w:w="4032"/>
-            <w:shd w:fill="F8FAFC"/>
+            <w:shd w:fill="FFFFFF"/>
             <w:tcMar>
               <w:top w:w="80" w:type="dxa"/>
               <w:bottom w:w="80" w:type="dxa"/>
@@ -2334,7 +2439,7 @@
         <w:tc>
           <w:tcPr>
             <w:tcW w:type="dxa" w:w="3168"/>
-            <w:shd w:fill="FFFFFF"/>
+            <w:shd w:fill="F8FAFC"/>
             <w:tcMar>
               <w:top w:w="80" w:type="dxa"/>
               <w:bottom w:w="80" w:type="dxa"/>
@@ -2359,7 +2464,7 @@
         <w:tc>
           <w:tcPr>
             <w:tcW w:type="dxa" w:w="2160"/>
-            <w:shd w:fill="FFFFFF"/>
+            <w:shd w:fill="F8FAFC"/>
             <w:tcMar>
               <w:top w:w="80" w:type="dxa"/>
               <w:bottom w:w="80" w:type="dxa"/>
@@ -2384,7 +2489,7 @@
         <w:tc>
           <w:tcPr>
             <w:tcW w:type="dxa" w:w="4032"/>
-            <w:shd w:fill="FFFFFF"/>
+            <w:shd w:fill="F8FAFC"/>
             <w:tcMar>
               <w:top w:w="80" w:type="dxa"/>
               <w:bottom w:w="80" w:type="dxa"/>
@@ -2412,7 +2517,7 @@
         <w:tc>
           <w:tcPr>
             <w:tcW w:type="dxa" w:w="3168"/>
-            <w:shd w:fill="F8FAFC"/>
+            <w:shd w:fill="FFFFFF"/>
             <w:tcMar>
               <w:top w:w="80" w:type="dxa"/>
               <w:bottom w:w="80" w:type="dxa"/>
@@ -2437,7 +2542,7 @@
         <w:tc>
           <w:tcPr>
             <w:tcW w:type="dxa" w:w="2160"/>
-            <w:shd w:fill="F8FAFC"/>
+            <w:shd w:fill="FFFFFF"/>
             <w:tcMar>
               <w:top w:w="80" w:type="dxa"/>
               <w:bottom w:w="80" w:type="dxa"/>
@@ -2462,7 +2567,7 @@
         <w:tc>
           <w:tcPr>
             <w:tcW w:type="dxa" w:w="4032"/>
-            <w:shd w:fill="F8FAFC"/>
+            <w:shd w:fill="FFFFFF"/>
             <w:tcMar>
               <w:top w:w="80" w:type="dxa"/>
               <w:bottom w:w="80" w:type="dxa"/>
@@ -2490,7 +2595,7 @@
         <w:tc>
           <w:tcPr>
             <w:tcW w:type="dxa" w:w="3168"/>
-            <w:shd w:fill="FFFFFF"/>
+            <w:shd w:fill="F8FAFC"/>
             <w:tcMar>
               <w:top w:w="80" w:type="dxa"/>
               <w:bottom w:w="80" w:type="dxa"/>
@@ -2515,7 +2620,7 @@
         <w:tc>
           <w:tcPr>
             <w:tcW w:type="dxa" w:w="2160"/>
-            <w:shd w:fill="FFFFFF"/>
+            <w:shd w:fill="F8FAFC"/>
             <w:tcMar>
               <w:top w:w="80" w:type="dxa"/>
               <w:bottom w:w="80" w:type="dxa"/>
@@ -2540,7 +2645,7 @@
         <w:tc>
           <w:tcPr>
             <w:tcW w:type="dxa" w:w="4032"/>
-            <w:shd w:fill="FFFFFF"/>
+            <w:shd w:fill="F8FAFC"/>
             <w:tcMar>
               <w:top w:w="80" w:type="dxa"/>
               <w:bottom w:w="80" w:type="dxa"/>

</xml_diff>